<commit_message>
Refactor exercises.py: add pypdf import for PDF handling; update settings.json for auto import completions
</commit_message>
<xml_diff>
--- a/Book/chapter17/doc_exercises.docx
+++ b/Book/chapter17/doc_exercises.docx
@@ -182,7 +182,7 @@
           </w:tcPr>
           <w:p>
             <w:r>
-              <w:t>CJ</w:t>
+              <w:t>JC</w:t>
             </w:r>
           </w:p>
         </w:tc>
@@ -297,6 +297,48 @@
           <w:p>
             <w:r>
               <w:t>O-</w:t>
+            </w:r>
+          </w:p>
+        </w:tc>
+      </w:tr>
+      <w:tr>
+        <w:tc>
+          <w:tcPr>
+            <w:tcW w:type="dxa" w:w="2160"/>
+          </w:tcPr>
+          <w:p>
+            <w:r>
+              <w:t>Fifht</w:t>
+            </w:r>
+          </w:p>
+        </w:tc>
+        <w:tc>
+          <w:tcPr>
+            <w:tcW w:type="dxa" w:w="2160"/>
+          </w:tcPr>
+          <w:p>
+            <w:r>
+              <w:t>5</w:t>
+            </w:r>
+          </w:p>
+        </w:tc>
+        <w:tc>
+          <w:tcPr>
+            <w:tcW w:type="dxa" w:w="2160"/>
+          </w:tcPr>
+          <w:p>
+            <w:r>
+              <w:t>555</w:t>
+            </w:r>
+          </w:p>
+        </w:tc>
+        <w:tc>
+          <w:tcPr>
+            <w:tcW w:type="dxa" w:w="2160"/>
+          </w:tcPr>
+          <w:p>
+            <w:r>
+              <w:t>B-</w:t>
             </w:r>
           </w:p>
         </w:tc>

</xml_diff>

<commit_message>
Enhance docx_exercises.py: add functionality for adding new columns and images; save document after modifications
</commit_message>
<xml_diff>
--- a/Book/chapter17/doc_exercises.docx
+++ b/Book/chapter17/doc_exercises.docx
@@ -132,6 +132,7 @@
         <w:gridCol w:w="2160"/>
         <w:gridCol w:w="2160"/>
         <w:gridCol w:w="2160"/>
+        <w:gridCol w:w="2880"/>
       </w:tblGrid>
       <w:tr>
         <w:tc>
@@ -174,6 +175,16 @@
             </w:r>
           </w:p>
         </w:tc>
+        <w:tc>
+          <w:tcPr>
+            <w:tcW w:type="dxa" w:w="2880"/>
+          </w:tcPr>
+          <w:p>
+            <w:r>
+              <w:t>NEW</w:t>
+            </w:r>
+          </w:p>
+        </w:tc>
       </w:tr>
       <w:tr>
         <w:tc>
@@ -182,7 +193,7 @@
           </w:tcPr>
           <w:p>
             <w:r>
-              <w:t>JC</w:t>
+              <w:t>CJ</w:t>
             </w:r>
           </w:p>
         </w:tc>
@@ -213,6 +224,16 @@
           <w:p>
             <w:r>
               <w:t>A+</w:t>
+            </w:r>
+          </w:p>
+        </w:tc>
+        <w:tc>
+          <w:tcPr>
+            <w:tcW w:type="dxa" w:w="2880"/>
+          </w:tcPr>
+          <w:p>
+            <w:r>
+              <w:t>NEW</w:t>
             </w:r>
           </w:p>
         </w:tc>
@@ -258,6 +279,16 @@
             </w:r>
           </w:p>
         </w:tc>
+        <w:tc>
+          <w:tcPr>
+            <w:tcW w:type="dxa" w:w="2880"/>
+          </w:tcPr>
+          <w:p>
+            <w:r>
+              <w:t>NEW</w:t>
+            </w:r>
+          </w:p>
+        </w:tc>
       </w:tr>
       <w:tr>
         <w:tc>
@@ -300,50 +331,54 @@
             </w:r>
           </w:p>
         </w:tc>
-      </w:tr>
-      <w:tr>
         <w:tc>
           <w:tcPr>
-            <w:tcW w:type="dxa" w:w="2160"/>
+            <w:tcW w:type="dxa" w:w="2880"/>
           </w:tcPr>
           <w:p>
             <w:r>
-              <w:t>Fifht</w:t>
-            </w:r>
-          </w:p>
-        </w:tc>
-        <w:tc>
-          <w:tcPr>
-            <w:tcW w:type="dxa" w:w="2160"/>
-          </w:tcPr>
-          <w:p>
-            <w:r>
-              <w:t>5</w:t>
-            </w:r>
-          </w:p>
-        </w:tc>
-        <w:tc>
-          <w:tcPr>
-            <w:tcW w:type="dxa" w:w="2160"/>
-          </w:tcPr>
-          <w:p>
-            <w:r>
-              <w:t>555</w:t>
-            </w:r>
-          </w:p>
-        </w:tc>
-        <w:tc>
-          <w:tcPr>
-            <w:tcW w:type="dxa" w:w="2160"/>
-          </w:tcPr>
-          <w:p>
-            <w:r>
-              <w:t>B-</w:t>
+              <w:t>NEW</w:t>
             </w:r>
           </w:p>
         </w:tc>
       </w:tr>
     </w:tbl>
+    <w:p>
+      <w:r>
+        <w:drawing>
+          <wp:inline xmlns:a="http://schemas.openxmlformats.org/drawingml/2006/main" xmlns:pic="http://schemas.openxmlformats.org/drawingml/2006/picture">
+            <wp:extent cx="1800000" cy="3600000"/>
+            <wp:docPr id="1" name="Picture 1"/>
+            <wp:cNvGraphicFramePr>
+              <a:graphicFrameLocks noChangeAspect="1"/>
+            </wp:cNvGraphicFramePr>
+            <a:graphic>
+              <a:graphicData uri="http://schemas.openxmlformats.org/drawingml/2006/picture">
+                <pic:pic>
+                  <pic:nvPicPr>
+                    <pic:cNvPr id="0" name="zophie.png"/>
+                    <pic:cNvPicPr/>
+                  </pic:nvPicPr>
+                  <pic:blipFill>
+                    <a:blip r:embed="rId9"/>
+                    <a:stretch>
+                      <a:fillRect/>
+                    </a:stretch>
+                  </pic:blipFill>
+                  <pic:spPr>
+                    <a:xfrm>
+                      <a:off x="0" y="0"/>
+                      <a:ext cx="1800000" cy="3600000"/>
+                    </a:xfrm>
+                    <a:prstGeom prst="rect"/>
+                  </pic:spPr>
+                </pic:pic>
+              </a:graphicData>
+            </a:graphic>
+          </wp:inline>
+        </w:drawing>
+      </w:r>
+    </w:p>
     <w:sectPr>
       <w:pgSz w:w="12240" w:h="15840"/>
       <w:pgMar w:top="1440" w:right="1800" w:bottom="1440" w:left="1800" w:header="720" w:footer="720" w:gutter="0"/>

</xml_diff>